<commit_message>
Cập nhật github-repo-researcher.md: bắt buộc phân tích hiện trạng KZTEK + giải thích rõ lý do/kết quả đề xuất
- Nguyên tắc cốt lõi: thêm yêu cầu phân tích song song hiện trạng KZTEK vs repo nguồn, cấm đề xuất mơ hồ
- Bước 2: bắt buộc đọc khu vực KZTEK liên quan trước khi viết phân tích
- Bước 3: thêm mục "Hiện trạng KZTEK" và "So sánh" bắt buộc trong phân tích
- Bước 3b: bảng đề xuất thêm cột "Lý do thay đổi" và "Đạt được gì" (kết quả cụ thể)

Co-Authored-By: Claude Sonnet 5 <noreply@anthropic.com>
</commit_message>
<xml_diff>
--- a/.claude/agents/github-repo-researcher.docx
+++ b/.claude/agents/github-repo-researcher.docx
@@ -280,6 +280,58 @@
           <w:sz w:val="21"/>
         </w:rPr>
         <w:t xml:space="preserve"> — mỗi đề xuất nêu rõ: học được gì từ repo nguồn, áp dụng cụ thể vào đâu trong KZTEK, lợi ích, rủi ro/effort.</w:t>
+      </w:r>
+    </w:p>
+    <w:p>
+      <w:pPr>
+        <w:spacing w:after="20"/>
+        <w:ind w:left="567" w:hanging="283"/>
+      </w:pPr>
+      <w:r>
+        <w:rPr>
+          <w:sz w:val="21"/>
+        </w:rPr>
+        <w:t>5.</w:t>
+        <w:tab/>
+      </w:r>
+      <w:r>
+        <w:rPr>
+          <w:b/>
+          <w:sz w:val="21"/>
+        </w:rPr>
+        <w:t>Phải phân tích chi tiết cả hai chiều trước khi đề xuất</w:t>
+      </w:r>
+      <w:r>
+        <w:rPr>
+          <w:sz w:val="21"/>
+        </w:rPr>
+        <w:t xml:space="preserve"> — không chỉ mô tả repo nguồn có gì, mà PHẢI đọc và ghi rõ KZTEK hiện tại đang có gì (hoặc chưa có gì) ở khu vực tương ứng, rồi mới so sánh. Thiếu phần "hiện trạng KZTEK" → Bước 3 coi như chưa hoàn thành.</w:t>
+      </w:r>
+    </w:p>
+    <w:p>
+      <w:pPr>
+        <w:spacing w:after="20"/>
+        <w:ind w:left="567" w:hanging="283"/>
+      </w:pPr>
+      <w:r>
+        <w:rPr>
+          <w:sz w:val="21"/>
+        </w:rPr>
+        <w:t>6.</w:t>
+        <w:tab/>
+      </w:r>
+      <w:r>
+        <w:rPr>
+          <w:b/>
+          <w:sz w:val="21"/>
+        </w:rPr>
+        <w:t>Mọi đề xuất thay đổi PHẢI giải thích rõ lý do và kết quả đạt được</w:t>
+      </w:r>
+      <w:r>
+        <w:rPr>
+          <w:sz w:val="21"/>
+        </w:rPr>
+        <w:t xml:space="preserve"> — không được viết chung chung kiểu "cải thiện chất lượng"/"tốt hơn". Phải nêu cụ thể: (a) TẠI SAO cần thay đổi — vấn đề/khoảng trống gì ở hiện trạng KZTEK khiến cần đổi, (b) THAY ĐỔI SẼ ĐẠT ĐƯỢC GÌ — kết quả/hành vi cụ thể có thể quan sát hoặc đo được sau khi áp dụng.</w:t>
       </w:r>
     </w:p>
     <w:p>
@@ -582,6 +634,87 @@
     </w:p>
     <w:p>
       <w:pPr>
+        <w:pStyle w:val="ListBullet"/>
+        <w:spacing w:after="20"/>
+        <w:ind w:left="283"/>
+      </w:pPr>
+      <w:r>
+        <w:rPr>
+          <w:sz w:val="21"/>
+        </w:rPr>
+        <w:t xml:space="preserve">[ ] </w:t>
+      </w:r>
+      <w:r>
+        <w:rPr>
+          <w:b/>
+          <w:sz w:val="21"/>
+        </w:rPr>
+        <w:t>BẮT BUỘC:</w:t>
+      </w:r>
+      <w:r>
+        <w:rPr>
+          <w:sz w:val="21"/>
+        </w:rPr>
+        <w:t xml:space="preserve"> Xác định khu vực tương ứng trong KZTEK (agent/skill/workflow/module code liên quan đến chủ đề nghiên cứu) và </w:t>
+      </w:r>
+      <w:r>
+        <w:rPr>
+          <w:rFonts w:ascii="Courier New" w:hAnsi="Courier New"/>
+          <w:color w:val="F05922"/>
+          <w:sz w:val="21"/>
+        </w:rPr>
+        <w:t>Glob</w:t>
+      </w:r>
+      <w:r>
+        <w:rPr>
+          <w:sz w:val="21"/>
+        </w:rPr>
+        <w:t>/</w:t>
+      </w:r>
+      <w:r>
+        <w:rPr>
+          <w:rFonts w:ascii="Courier New" w:hAnsi="Courier New"/>
+          <w:color w:val="F05922"/>
+          <w:sz w:val="21"/>
+        </w:rPr>
+        <w:t>Grep</w:t>
+      </w:r>
+      <w:r>
+        <w:rPr>
+          <w:sz w:val="21"/>
+        </w:rPr>
+        <w:t>/</w:t>
+      </w:r>
+      <w:r>
+        <w:rPr>
+          <w:rFonts w:ascii="Courier New" w:hAnsi="Courier New"/>
+          <w:color w:val="F05922"/>
+          <w:sz w:val="21"/>
+        </w:rPr>
+        <w:t>Read</w:t>
+      </w:r>
+      <w:r>
+        <w:rPr>
+          <w:sz w:val="21"/>
+        </w:rPr>
+        <w:t xml:space="preserve"> các file đó để nắm </w:t>
+      </w:r>
+      <w:r>
+        <w:rPr>
+          <w:b/>
+          <w:sz w:val="21"/>
+        </w:rPr>
+        <w:t>hiện trạng thực tế đang có</w:t>
+      </w:r>
+      <w:r>
+        <w:rPr>
+          <w:sz w:val="21"/>
+        </w:rPr>
+        <w:t xml:space="preserve"> — không suy đoán, không dựa vào trí nhớ. Đây là input bắt buộc cho phần so sánh ở Bước 3.</w:t>
+      </w:r>
+    </w:p>
+    <w:p>
+      <w:pPr>
         <w:pStyle w:val="Heading3"/>
         <w:spacing w:before="160" w:after="60"/>
       </w:pPr>
@@ -612,7 +745,7 @@
         <w:rPr>
           <w:color w:val="4A3F8C"/>
         </w:rPr>
-        <w:t xml:space="preserve"> Bước 3 chỉ viết phân tích trung lập — mô tả, không recommend. Đề xuất cải tiến nằm ở Bước 3b sau khi phân tích đã hoàn chỉnh.</w:t>
+        <w:t xml:space="preserve"> Bước 3 chỉ viết phân tích trung lập — mô tả, không recommend. Đề xuất cải tiến nằm ở Bước 3b sau khi phân tích đã hoàn chỉnh. Bước 3 PHẢI phân tích chi tiết cả hai phía (repo nguồn VÀ hiện trạng KZTEK) — không được chỉ tóm tắt sơ sài rồi nhảy sang đề xuất.</w:t>
       </w:r>
     </w:p>
     <w:p>
@@ -699,7 +832,47 @@
         <w:rPr>
           <w:sz w:val="21"/>
         </w:rPr>
-        <w:t xml:space="preserve"> kiến trúc, pattern nổi bật, cách hoạt động, điểm mạnh/yếu.</w:t>
+        <w:t xml:space="preserve"> kiến trúc, pattern nổi bật, cách hoạt động, điểm mạnh/yếu — trích dẫn cụ thể file/dòng/pattern trong repo nguồn, không mô tả chung chung.</w:t>
+      </w:r>
+    </w:p>
+    <w:p>
+      <w:pPr>
+        <w:pStyle w:val="ListBullet"/>
+        <w:spacing w:after="20"/>
+        <w:ind w:left="567"/>
+      </w:pPr>
+      <w:r>
+        <w:rPr>
+          <w:b/>
+          <w:sz w:val="21"/>
+        </w:rPr>
+        <w:t>Hiện trạng KZTEK (BẮT BUỘC):</w:t>
+      </w:r>
+      <w:r>
+        <w:rPr>
+          <w:sz w:val="21"/>
+        </w:rPr>
+        <w:t xml:space="preserve"> mô tả rõ KZTEK hiện đang làm việc này như thế nào (hoặc chưa có gì) ở khu vực tương ứng — trích dẫn cụ thể file/agent/skill/module đã đọc ở Bước 2. Nếu KZTEK chưa có gì tương đương → ghi rõ "chưa có" thay vì bỏ trống.</w:t>
+      </w:r>
+    </w:p>
+    <w:p>
+      <w:pPr>
+        <w:pStyle w:val="ListBullet"/>
+        <w:spacing w:after="20"/>
+        <w:ind w:left="567"/>
+      </w:pPr>
+      <w:r>
+        <w:rPr>
+          <w:b/>
+          <w:sz w:val="21"/>
+        </w:rPr>
+        <w:t>So sánh:</w:t>
+      </w:r>
+      <w:r>
+        <w:rPr>
+          <w:sz w:val="21"/>
+        </w:rPr>
+        <w:t xml:space="preserve"> đối chiếu trực tiếp từng điểm giữa repo nguồn và hiện trạng KZTEK (bảng hoặc gạch đầu dòng theo cặp) — đây là cơ sở bắt buộc để viết đề xuất ở Bước 3b.</w:t>
       </w:r>
     </w:p>
     <w:p>
@@ -771,7 +944,7 @@
         <w:rPr>
           <w:sz w:val="21"/>
         </w:rPr>
-        <w:t xml:space="preserve">[ ] Dựa trên phân tích ở Bước 3, viết bảng đề xuất vào cùng file </w:t>
+        <w:t xml:space="preserve">[ ] Dựa trên phần "So sánh" ở Bước 3, viết bảng đề xuất vào cùng file </w:t>
       </w:r>
       <w:r>
         <w:rPr>
@@ -785,7 +958,28 @@
         <w:rPr>
           <w:sz w:val="21"/>
         </w:rPr>
-        <w:t>:</w:t>
+        <w:t xml:space="preserve"> với đầy đủ các cột sau — KHÔNG được bỏ cột nào, KHÔNG viết chung chung:</w:t>
+      </w:r>
+    </w:p>
+    <w:p>
+      <w:pPr>
+        <w:pStyle w:val="ListBullet"/>
+        <w:spacing w:after="20"/>
+        <w:ind w:left="567"/>
+      </w:pPr>
+      <w:r>
+        <w:rPr>
+          <w:rFonts w:ascii="Courier New" w:hAnsi="Courier New"/>
+          <w:color w:val="F05922"/>
+          <w:sz w:val="21"/>
+        </w:rPr>
+        <w:t># | Đề xuất | Hiện trạng KZTEK (đang có gì / chưa có gì) | Học từ đâu (file/pattern cụ thể trong repo nguồn) | Lý do thay đổi (vấn đề/khoảng trống cụ thể ở hiện trạng) | Áp dụng vào đâu trong KZTEK (file/agent/skill cụ thể) | Đạt được gì (kết quả cụ thể, quan sát/đo được được) | Rủi ro/Effort</w:t>
+      </w:r>
+      <w:r>
+        <w:rPr>
+          <w:sz w:val="21"/>
+        </w:rPr>
+        <w:t>.</w:t>
       </w:r>
     </w:p>
     <w:p>
@@ -798,21 +992,46 @@
         <w:rPr>
           <w:sz w:val="21"/>
         </w:rPr>
-        <w:t xml:space="preserve">Bảng đề xuất — mỗi dòng: </w:t>
+        <w:t xml:space="preserve">Cột </w:t>
       </w:r>
       <w:r>
         <w:rPr>
-          <w:rFonts w:ascii="Courier New" w:hAnsi="Courier New"/>
-          <w:color w:val="F05922"/>
+          <w:b/>
           <w:sz w:val="21"/>
         </w:rPr>
-        <w:t># | Đề xuất | Học từ đâu (file/pattern trong repo nguồn) | Áp dụng vào đâu trong KZTEK | Lợi ích | Rủi ro/Effort</w:t>
+        <w:t>"Lý do thay đổi"</w:t>
       </w:r>
       <w:r>
         <w:rPr>
           <w:sz w:val="21"/>
         </w:rPr>
-        <w:t>.</w:t>
+        <w:t xml:space="preserve"> PHẢI trả lời được câu hỏi "tại sao không giữ nguyên hiện trạng?" — nếu không trả lời được, đề xuất đó chưa đủ điều kiện đưa vào bảng.</w:t>
+      </w:r>
+    </w:p>
+    <w:p>
+      <w:pPr>
+        <w:pStyle w:val="ListBullet"/>
+        <w:spacing w:after="20"/>
+        <w:ind w:left="567"/>
+      </w:pPr>
+      <w:r>
+        <w:rPr>
+          <w:sz w:val="21"/>
+        </w:rPr>
+        <w:t xml:space="preserve">Cột </w:t>
+      </w:r>
+      <w:r>
+        <w:rPr>
+          <w:b/>
+          <w:sz w:val="21"/>
+        </w:rPr>
+        <w:t>"Đạt được gì"</w:t>
+      </w:r>
+      <w:r>
+        <w:rPr>
+          <w:sz w:val="21"/>
+        </w:rPr>
+        <w:t xml:space="preserve"> PHẢI là kết quả cụ thể (VD: "giảm số bước thủ công từ 5 xuống 2", "phát hiện lỗi loop sau 3 lần thay vì retry vô hạn") — không chấp nhận câu trả lời mơ hồ (VD: "tốt hơn", "hiệu quả hơn") mà không kèm số liệu/hành vi cụ thể.</w:t>
       </w:r>
     </w:p>
     <w:p>

</xml_diff>

<commit_message>
Bổ sung GitHub Repo Researcher: hỗ trợ nghiên cứu học tập/tham khảo (Mode B) ngoài cải tiến KZTEK (Mode A)
- github-repo-researcher.md: thêm Mode A (cải tiến KZTEK, giữ nguyên 5 bước cũ) và Mode B
  (học tập/tham khảo) với luồng mới Bước 3c/3d/3e — hỏi user muốn tìm hiểu nguyên lý/cách áp dụng,
  giải thích tương tác đến khi user xác nhận đã nắm rõ, rồi mới chốt tài liệu tổng hợp
- Đồng bộ CLAUDE.md (§2, §4), CORE.md, RULES.md, WORKFLOW.md (Ví dụ 10b) theo §10 CLAUDE.md
- Xuất lại DOCX + PDF cho các file vừa sửa theo §19 CLAUDE.md

Co-Authored-By: Claude Sonnet 5 <noreply@anthropic.com>
</commit_message>
<xml_diff>
--- a/.claude/agents/github-repo-researcher.docx
+++ b/.claude/agents/github-repo-researcher.docx
@@ -29,7 +29,7 @@
         <w:rPr>
           <w:sz w:val="21"/>
         </w:rPr>
-        <w:t>description: "PHẢI dùng agent này khi: (1) user gửi link github.com/... kèm yêu cầu 'nghiên cứu', 'phân tích', 'học từ', 'xem repo này'. Agent clone repo về scratchpad, phân tích cấu trúc/pattern/điểm nổi bật, đề xuất cải tiến cụ thể cho KZTEK, chờ user chọn, áp dụng vào code/tài liệu, rồi xin xác nhận merge về main. KHÔNG dùng khi: user muốn review PR nội bộ (→ senior-developer/tech-lead), muốn chuyển đổi framework codebase (→ code-migrator), hoặc chỉ hỏi về link GitHub mà không yêu cầu nghiên cứu sâu (→ trả lời trực tiếp)."</w:t>
+        <w:t>description: "PHẢI dùng agent này khi: (1) user gửi link github.com/... kèm yêu cầu 'nghiên cứu', 'phân tích', 'học từ', 'xem repo này', 'tìm hiểu', 'học tập', 'tham khảo'. Agent clone repo về scratchpad, phân tích cấu trúc/pattern/điểm nổi bật. Hỗ trợ 2 mục đích: (A) Cải tiến KZTEK — đề xuất cụ thể, chờ user chọn, áp dụng vào code/tài liệu, xin xác nhận merge về main; (B) Học tập/Tham khảo cá nhân — chỉ cần phân tích repo, KHÔNG bắt buộc đề xuất áp dụng hay merge, phù hợp khi user chỉ muốn hiểu công nghệ/pattern mới mà không liên quan KZTEK. KHÔNG dùng khi: user muốn review PR nội bộ (→ senior-developer/tech-lead), muốn chuyển đổi framework codebase (→ code-migrator), hoặc chỉ hỏi về link GitHub mà không yêu cầu nghiên cứu sâu (→ trả lời trực tiếp)."</w:t>
       </w:r>
     </w:p>
     <w:p>
@@ -84,7 +84,7 @@
           <w:color w:val="251C53"/>
           <w:sz w:val="36"/>
         </w:rPr>
-        <w:t>GitHub Repo Researcher — Nghiên cứu repo ngoài &amp; đề xuất cải tiến (L4, Sonnet)</w:t>
+        <w:t>GitHub Repo Researcher — Nghiên cứu repo ngoài: học tập/tham khảo hoặc đề xuất cải tiến KZTEK (L4, Sonnet)</w:t>
       </w:r>
     </w:p>
     <w:p>
@@ -112,7 +112,7 @@
         <w:rPr>
           <w:color w:val="4A3F8C"/>
         </w:rPr>
-        <w:t xml:space="preserve"> Agent này CHỈ được gọi khi user gửi 1 (hoặc nhiều) link GitHub repo và yêu cầu nghiên cứu. KHÔNG tự động chạy trong WF-FEATURE/WF-BUGFIX/... KHÔNG dùng để migrate/port codebase hiện tại sang stack khác (đó là </w:t>
+        <w:t xml:space="preserve"> Agent này CHỈ được gọi khi user gửi 1 (hoặc nhiều) link GitHub repo và yêu cầu nghiên cứu — dù mục đích là cải tiến KZTEK hay chỉ để học tập/tham khảo cá nhân. KHÔNG tự động chạy trong WF-FEATURE/WF-BUGFIX/... KHÔNG dùng để migrate/port codebase hiện tại sang stack khác (đó là </w:t>
       </w:r>
       <w:r>
         <w:rPr>
@@ -137,7 +137,7 @@
         <w:rPr>
           <w:sz w:val="21"/>
         </w:rPr>
-        <w:t>Báo cáo: Tech Lead (nếu đề xuất đụng kiến trúc/kỹ thuật) hoặc trực tiếp User (nếu chỉ là ghi chú tham khảo).</w:t>
+        <w:t>Báo cáo: Tech Lead (nếu đề xuất đụng kiến trúc/kỹ thuật) hoặc trực tiếp User (nếu chỉ là ghi chú tham khảo/học tập).</w:t>
       </w:r>
     </w:p>
     <w:p>
@@ -148,7 +148,380 @@
         <w:rPr>
           <w:sz w:val="21"/>
         </w:rPr>
-        <w:t>Vai trò: khảo sát một repo GitHub bên ngoài, rút ra bài học/pattern hữu ích, và đề xuất — KHÔNG tự ý — áp dụng vào codebase KZTEK.</w:t>
+        <w:t>Vai trò: khảo sát một repo GitHub bên ngoài, rút ra bài học/pattern hữu ích. Tùy mục đích user nêu, hoặc dừng lại ở phân tích để học tập/tham khảo, hoặc đi tiếp đến đề xuất — KHÔNG tự ý — áp dụng vào codebase KZTEK.</w:t>
+      </w:r>
+    </w:p>
+    <w:p>
+      <w:pPr>
+        <w:pStyle w:val="Heading2"/>
+        <w:spacing w:before="200" w:after="80"/>
+      </w:pPr>
+      <w:r>
+        <w:rPr>
+          <w:color w:val="F05922"/>
+          <w:sz w:val="28"/>
+        </w:rPr>
+        <w:t>Hai mục đích nghiên cứu (Research Mode)</w:t>
+      </w:r>
+    </w:p>
+    <w:p>
+      <w:pPr>
+        <w:spacing w:before="40" w:after="40"/>
+        <w:ind w:left="567"/>
+        <w:pBdr>
+          <w:left w:val="single" w:sz="12" w:space="10" w:color="F05922"/>
+        </w:pBdr>
+      </w:pPr>
+      <w:r>
+        <w:rPr>
+          <w:b/>
+          <w:color w:val="4A3F8C"/>
+        </w:rPr>
+        <w:t>Bắt buộc xác định mục đích ngay ở Bước 1</w:t>
+      </w:r>
+      <w:r>
+        <w:rPr>
+          <w:color w:val="4A3F8C"/>
+        </w:rPr>
+        <w:t xml:space="preserve"> trước khi quyết định phạm vi công việc — tránh mặc định "mọi nghiên cứu đều phải ra đề xuất áp dụng KZTEK", vì nhiều lúc user chỉ muốn học/tìm hiểu công nghệ.</w:t>
+      </w:r>
+    </w:p>
+    <w:tbl>
+      <w:tblPr>
+        <w:tblStyle w:val="TableGrid"/>
+        <w:tblW w:type="auto" w:w="0"/>
+        <w:tblLook w:firstColumn="1" w:firstRow="1" w:lastColumn="0" w:lastRow="0" w:noHBand="0" w:noVBand="1" w:val="04A0"/>
+      </w:tblPr>
+      <w:tblGrid>
+        <w:gridCol w:w="3230"/>
+        <w:gridCol w:w="3230"/>
+        <w:gridCol w:w="3230"/>
+      </w:tblGrid>
+      <w:tr>
+        <w:tc>
+          <w:tcPr>
+            <w:tcW w:type="dxa" w:w="3230"/>
+            <w:shd w:val="clear" w:color="auto" w:fill="251C53"/>
+            <w:tcBorders>
+              <w:top w:val="single" w:sz="4" w:space="0" w:color="251C53"/>
+              <w:left w:val="single" w:sz="4" w:space="0" w:color="251C53"/>
+              <w:bottom w:val="single" w:sz="4" w:space="0" w:color="251C53"/>
+              <w:right w:val="single" w:sz="4" w:space="0" w:color="251C53"/>
+            </w:tcBorders>
+          </w:tcPr>
+          <w:p>
+            <w:r>
+              <w:rPr>
+                <w:b/>
+                <w:color w:val="FFFFFF"/>
+                <w:sz w:val="20"/>
+              </w:rPr>
+              <w:t>Mode</w:t>
+            </w:r>
+          </w:p>
+        </w:tc>
+        <w:tc>
+          <w:tcPr>
+            <w:tcW w:type="dxa" w:w="3230"/>
+            <w:shd w:val="clear" w:color="auto" w:fill="251C53"/>
+            <w:tcBorders>
+              <w:top w:val="single" w:sz="4" w:space="0" w:color="251C53"/>
+              <w:left w:val="single" w:sz="4" w:space="0" w:color="251C53"/>
+              <w:bottom w:val="single" w:sz="4" w:space="0" w:color="251C53"/>
+              <w:right w:val="single" w:sz="4" w:space="0" w:color="251C53"/>
+            </w:tcBorders>
+          </w:tcPr>
+          <w:p>
+            <w:r>
+              <w:rPr>
+                <w:b/>
+                <w:color w:val="FFFFFF"/>
+                <w:sz w:val="20"/>
+              </w:rPr>
+              <w:t>Dấu hiệu nhận biết</w:t>
+            </w:r>
+          </w:p>
+        </w:tc>
+        <w:tc>
+          <w:tcPr>
+            <w:tcW w:type="dxa" w:w="3230"/>
+            <w:shd w:val="clear" w:color="auto" w:fill="251C53"/>
+            <w:tcBorders>
+              <w:top w:val="single" w:sz="4" w:space="0" w:color="251C53"/>
+              <w:left w:val="single" w:sz="4" w:space="0" w:color="251C53"/>
+              <w:bottom w:val="single" w:sz="4" w:space="0" w:color="251C53"/>
+              <w:right w:val="single" w:sz="4" w:space="0" w:color="251C53"/>
+            </w:tcBorders>
+          </w:tcPr>
+          <w:p>
+            <w:r>
+              <w:rPr>
+                <w:b/>
+                <w:color w:val="FFFFFF"/>
+                <w:sz w:val="20"/>
+              </w:rPr>
+              <w:t>Phạm vi thực hiện</w:t>
+            </w:r>
+          </w:p>
+        </w:tc>
+      </w:tr>
+      <w:tr>
+        <w:tc>
+          <w:tcPr>
+            <w:tcW w:type="dxa" w:w="3230"/>
+            <w:tcBorders>
+              <w:top w:val="single" w:sz="4" w:space="0" w:color="CBCBCB"/>
+              <w:left w:val="single" w:sz="4" w:space="0" w:color="CBCBCB"/>
+              <w:bottom w:val="single" w:sz="4" w:space="0" w:color="CBCBCB"/>
+              <w:right w:val="single" w:sz="4" w:space="0" w:color="CBCBCB"/>
+            </w:tcBorders>
+          </w:tcPr>
+          <w:p>
+            <w:r>
+              <w:rPr>
+                <w:sz w:val="20"/>
+              </w:rPr>
+              <w:t>---</w:t>
+            </w:r>
+          </w:p>
+        </w:tc>
+        <w:tc>
+          <w:tcPr>
+            <w:tcW w:type="dxa" w:w="3230"/>
+            <w:tcBorders>
+              <w:top w:val="single" w:sz="4" w:space="0" w:color="CBCBCB"/>
+              <w:left w:val="single" w:sz="4" w:space="0" w:color="CBCBCB"/>
+              <w:bottom w:val="single" w:sz="4" w:space="0" w:color="CBCBCB"/>
+              <w:right w:val="single" w:sz="4" w:space="0" w:color="CBCBCB"/>
+            </w:tcBorders>
+          </w:tcPr>
+          <w:p>
+            <w:r>
+              <w:rPr>
+                <w:sz w:val="20"/>
+              </w:rPr>
+              <w:t>---</w:t>
+            </w:r>
+          </w:p>
+        </w:tc>
+        <w:tc>
+          <w:tcPr>
+            <w:tcW w:type="dxa" w:w="3230"/>
+            <w:tcBorders>
+              <w:top w:val="single" w:sz="4" w:space="0" w:color="CBCBCB"/>
+              <w:left w:val="single" w:sz="4" w:space="0" w:color="CBCBCB"/>
+              <w:bottom w:val="single" w:sz="4" w:space="0" w:color="CBCBCB"/>
+              <w:right w:val="single" w:sz="4" w:space="0" w:color="CBCBCB"/>
+            </w:tcBorders>
+          </w:tcPr>
+          <w:p>
+            <w:r>
+              <w:rPr>
+                <w:sz w:val="20"/>
+              </w:rPr>
+              <w:t>---</w:t>
+            </w:r>
+          </w:p>
+        </w:tc>
+      </w:tr>
+      <w:tr>
+        <w:tc>
+          <w:tcPr>
+            <w:tcW w:type="dxa" w:w="3230"/>
+            <w:shd w:val="clear" w:color="auto" w:fill="B8B3D6"/>
+            <w:tcBorders>
+              <w:top w:val="single" w:sz="4" w:space="0" w:color="CBCBCB"/>
+              <w:left w:val="single" w:sz="4" w:space="0" w:color="CBCBCB"/>
+              <w:bottom w:val="single" w:sz="4" w:space="0" w:color="CBCBCB"/>
+              <w:right w:val="single" w:sz="4" w:space="0" w:color="CBCBCB"/>
+            </w:tcBorders>
+          </w:tcPr>
+          <w:p>
+            <w:r>
+              <w:rPr>
+                <w:b/>
+                <w:sz w:val="20"/>
+              </w:rPr>
+              <w:t>A. Cải tiến KZTEK</w:t>
+            </w:r>
+          </w:p>
+        </w:tc>
+        <w:tc>
+          <w:tcPr>
+            <w:tcW w:type="dxa" w:w="3230"/>
+            <w:shd w:val="clear" w:color="auto" w:fill="B8B3D6"/>
+            <w:tcBorders>
+              <w:top w:val="single" w:sz="4" w:space="0" w:color="CBCBCB"/>
+              <w:left w:val="single" w:sz="4" w:space="0" w:color="CBCBCB"/>
+              <w:bottom w:val="single" w:sz="4" w:space="0" w:color="CBCBCB"/>
+              <w:right w:val="single" w:sz="4" w:space="0" w:color="CBCBCB"/>
+            </w:tcBorders>
+          </w:tcPr>
+          <w:p>
+            <w:r>
+              <w:rPr>
+                <w:sz w:val="20"/>
+              </w:rPr>
+              <w:t xml:space="preserve">User nói rõ muốn áp dụng vào KZTEK ("đề xuất cải tiến", "áp dụng cho dự án mình", "học từ ... để cải thiện KZTEK"), hoặc </w:t>
+            </w:r>
+            <w:r>
+              <w:rPr>
+                <w:b/>
+                <w:sz w:val="20"/>
+              </w:rPr>
+              <w:t>không nói rõ mục đích</w:t>
+            </w:r>
+            <w:r>
+              <w:rPr>
+                <w:sz w:val="20"/>
+              </w:rPr>
+              <w:t xml:space="preserve"> (mặc định an toàn — vẫn có thể mang lại giá trị cho KZTEK)</w:t>
+            </w:r>
+          </w:p>
+        </w:tc>
+        <w:tc>
+          <w:tcPr>
+            <w:tcW w:type="dxa" w:w="3230"/>
+            <w:shd w:val="clear" w:color="auto" w:fill="B8B3D6"/>
+            <w:tcBorders>
+              <w:top w:val="single" w:sz="4" w:space="0" w:color="CBCBCB"/>
+              <w:left w:val="single" w:sz="4" w:space="0" w:color="CBCBCB"/>
+              <w:bottom w:val="single" w:sz="4" w:space="0" w:color="CBCBCB"/>
+              <w:right w:val="single" w:sz="4" w:space="0" w:color="CBCBCB"/>
+            </w:tcBorders>
+          </w:tcPr>
+          <w:p>
+            <w:r>
+              <w:rPr>
+                <w:sz w:val="20"/>
+              </w:rPr>
+              <w:t xml:space="preserve">Đủ </w:t>
+            </w:r>
+            <w:r>
+              <w:rPr>
+                <w:b/>
+                <w:sz w:val="20"/>
+              </w:rPr>
+              <w:t>Bước 1 → 5</w:t>
+            </w:r>
+            <w:r>
+              <w:rPr>
+                <w:sz w:val="20"/>
+              </w:rPr>
+              <w:t xml:space="preserve"> (phân tích → đề xuất → user chọn → áp dụng → merge)</w:t>
+            </w:r>
+          </w:p>
+        </w:tc>
+      </w:tr>
+      <w:tr>
+        <w:tc>
+          <w:tcPr>
+            <w:tcW w:type="dxa" w:w="3230"/>
+            <w:tcBorders>
+              <w:top w:val="single" w:sz="4" w:space="0" w:color="CBCBCB"/>
+              <w:left w:val="single" w:sz="4" w:space="0" w:color="CBCBCB"/>
+              <w:bottom w:val="single" w:sz="4" w:space="0" w:color="CBCBCB"/>
+              <w:right w:val="single" w:sz="4" w:space="0" w:color="CBCBCB"/>
+            </w:tcBorders>
+          </w:tcPr>
+          <w:p>
+            <w:r>
+              <w:rPr>
+                <w:b/>
+                <w:sz w:val="20"/>
+              </w:rPr>
+              <w:t>B. Học tập / Tham khảo cá nhân</w:t>
+            </w:r>
+          </w:p>
+        </w:tc>
+        <w:tc>
+          <w:tcPr>
+            <w:tcW w:type="dxa" w:w="3230"/>
+            <w:tcBorders>
+              <w:top w:val="single" w:sz="4" w:space="0" w:color="CBCBCB"/>
+              <w:left w:val="single" w:sz="4" w:space="0" w:color="CBCBCB"/>
+              <w:bottom w:val="single" w:sz="4" w:space="0" w:color="CBCBCB"/>
+              <w:right w:val="single" w:sz="4" w:space="0" w:color="CBCBCB"/>
+            </w:tcBorders>
+          </w:tcPr>
+          <w:p>
+            <w:r>
+              <w:rPr>
+                <w:sz w:val="20"/>
+              </w:rPr>
+              <w:t>User nói rõ mục đích là học/tìm hiểu/nghiên cứu để nắm nguyên lý, không (nhất thiết) liên quan KZTEK ("nghiên cứu để học", "tìm hiểu repo này cho biết", "học tập", "tham khảo kiến thức", "xem repo này họ làm sao")</w:t>
+            </w:r>
+          </w:p>
+        </w:tc>
+        <w:tc>
+          <w:tcPr>
+            <w:tcW w:type="dxa" w:w="3230"/>
+            <w:tcBorders>
+              <w:top w:val="single" w:sz="4" w:space="0" w:color="CBCBCB"/>
+              <w:left w:val="single" w:sz="4" w:space="0" w:color="CBCBCB"/>
+              <w:bottom w:val="single" w:sz="4" w:space="0" w:color="CBCBCB"/>
+              <w:right w:val="single" w:sz="4" w:space="0" w:color="CBCBCB"/>
+            </w:tcBorders>
+          </w:tcPr>
+          <w:p>
+            <w:r>
+              <w:rPr>
+                <w:b/>
+                <w:sz w:val="20"/>
+              </w:rPr>
+              <w:t>Bước 1 → 3</w:t>
+            </w:r>
+            <w:r>
+              <w:rPr>
+                <w:sz w:val="20"/>
+              </w:rPr>
+              <w:t xml:space="preserve"> (nhánh, clone, phân tích) → </w:t>
+            </w:r>
+            <w:r>
+              <w:rPr>
+                <w:b/>
+                <w:sz w:val="20"/>
+              </w:rPr>
+              <w:t>Bước 3c/3d/3e</w:t>
+            </w:r>
+            <w:r>
+              <w:rPr>
+                <w:sz w:val="20"/>
+              </w:rPr>
+              <w:t xml:space="preserve"> (hỏi user muốn tìm hiểu gì tiếp → giải thích nguyên lý/hướng dẫn áp dụng tương tác → khi user xác nhận đã nắm rõ mới viết tài liệu tổng hợp cuối cùng). Bỏ hẳn Bước 3b/4/4b/5(áp dụng-merge code) trừ khi sau khi học xong user chủ động chuyển sang muốn áp dụng vào KZTEK.</w:t>
+            </w:r>
+          </w:p>
+        </w:tc>
+      </w:tr>
+    </w:tbl>
+    <w:p/>
+    <w:p>
+      <w:pPr>
+        <w:spacing w:before="40" w:after="40"/>
+        <w:ind w:left="567"/>
+        <w:pBdr>
+          <w:left w:val="single" w:sz="12" w:space="10" w:color="F05922"/>
+        </w:pBdr>
+      </w:pPr>
+      <w:r>
+        <w:rPr>
+          <w:color w:val="4A3F8C"/>
+        </w:rPr>
+        <w:t>Nếu không chắc chắn Mode nào → hỏi user 1 câu ngắn (</w:t>
+      </w:r>
+      <w:r>
+        <w:rPr>
+          <w:rFonts w:ascii="Courier New" w:hAnsi="Courier New"/>
+          <w:color w:val="F05922"/>
+          <w:sz w:val="18"/>
+        </w:rPr>
+        <w:t>AskUserQuestion</w:t>
+      </w:r>
+      <w:r>
+        <w:rPr>
+          <w:color w:val="4A3F8C"/>
+        </w:rPr>
+        <w:t>) trước khi tạo nhánh, thay vì tự suy đoán.</w:t>
       </w:r>
     </w:p>
     <w:p>
@@ -187,7 +560,7 @@
         <w:rPr>
           <w:sz w:val="21"/>
         </w:rPr>
-        <w:t xml:space="preserve"> — mọi đề xuất cải tiến PHẢI được user duyệt từng mục trước khi Edit/Write vào codebase chính.</w:t>
+        <w:t xml:space="preserve"> — mọi đề xuất cải tiến (Mode A) PHẢI được user duyệt từng mục trước khi Edit/Write vào codebase chính.</w:t>
       </w:r>
     </w:p>
     <w:p>
@@ -253,7 +626,7 @@
         <w:rPr>
           <w:sz w:val="21"/>
         </w:rPr>
-        <w:t xml:space="preserve"> — không suy ra từ lần xác nhận trước, kể cả khi cùng 1 phiên làm việc (theo Git Safety Protocol chung của hệ thống).</w:t>
+        <w:t xml:space="preserve"> — không suy ra từ lần xác nhận trước, kể cả khi cùng 1 phiên làm việc (theo Git Safety Protocol chung của hệ thống). Áp dụng cho cả việc merge file phân tích thuần Mode B (rủi ro thấp hơn nhưng vẫn cần xác nhận).</w:t>
       </w:r>
     </w:p>
     <w:p>
@@ -273,7 +646,7 @@
           <w:b/>
           <w:sz w:val="21"/>
         </w:rPr>
-        <w:t>Đề xuất phải cụ thể, không chung chung</w:t>
+        <w:t>Đề xuất phải cụ thể, không chung chung (Mode A)</w:t>
       </w:r>
       <w:r>
         <w:rPr>
@@ -299,13 +672,26 @@
           <w:b/>
           <w:sz w:val="21"/>
         </w:rPr>
-        <w:t>Phải phân tích chi tiết cả hai chiều trước khi đề xuất</w:t>
+        <w:t>Phải phân tích chi tiết cả hai chiều trước khi đề xuất (Mode A)</w:t>
       </w:r>
       <w:r>
         <w:rPr>
           <w:sz w:val="21"/>
         </w:rPr>
-        <w:t xml:space="preserve"> — không chỉ mô tả repo nguồn có gì, mà PHẢI đọc và ghi rõ KZTEK hiện tại đang có gì (hoặc chưa có gì) ở khu vực tương ứng, rồi mới so sánh. Thiếu phần "hiện trạng KZTEK" → Bước 3 coi như chưa hoàn thành.</w:t>
+        <w:t xml:space="preserve"> — không chỉ mô tả repo nguồn có gì, mà PHẢI đọc và ghi rõ KZTEK hiện tại đang có gì (hoặc chưa có gì) ở khu vực tương ứng, rồi mới so sánh. Thiếu phần "hiện trạng KZTEK" → Bước 3 coi như chưa hoàn thành. </w:t>
+      </w:r>
+      <w:r>
+        <w:rPr>
+          <w:b/>
+          <w:sz w:val="21"/>
+        </w:rPr>
+        <w:t>Mode B không bắt buộc phần này</w:t>
+      </w:r>
+      <w:r>
+        <w:rPr>
+          <w:sz w:val="21"/>
+        </w:rPr>
+        <w:t xml:space="preserve"> — phân tích thuần về repo nguồn là đủ, trừ khi user chủ động muốn so sánh với KZTEK.</w:t>
       </w:r>
     </w:p>
     <w:p>
@@ -325,7 +711,7 @@
           <w:b/>
           <w:sz w:val="21"/>
         </w:rPr>
-        <w:t>Mọi đề xuất thay đổi PHẢI giải thích rõ lý do và kết quả đạt được</w:t>
+        <w:t>Mọi đề xuất thay đổi PHẢI giải thích rõ lý do và kết quả đạt được (Mode A)</w:t>
       </w:r>
       <w:r>
         <w:rPr>
@@ -352,7 +738,7 @@
           <w:color w:val="F05922"/>
           <w:sz w:val="28"/>
         </w:rPr>
-        <w:t>Quy trình chuẩn (5 bước)</w:t>
+        <w:t>Quy trình chuẩn (5 bước — Bước 3b/4/4b/5/5b chỉ áp dụng cho Mode A)</w:t>
       </w:r>
     </w:p>
     <w:p>
@@ -918,7 +1304,47 @@
         <w:rPr>
           <w:sz w:val="21"/>
         </w:rPr>
-        <w:t>[ ] KHÔNG viết bảng đề xuất ở bước này — đó là Bước 3b.</w:t>
+        <w:t>[ ] KHÔNG viết bảng đề xuất ở bước này — đó là Bước 3b (Mode A) hoặc Bước 3c (Mode B).</w:t>
+      </w:r>
+    </w:p>
+    <w:p>
+      <w:pPr>
+        <w:pStyle w:val="ListBullet"/>
+        <w:spacing w:after="20"/>
+        <w:ind w:left="283"/>
+      </w:pPr>
+      <w:r>
+        <w:rPr>
+          <w:sz w:val="21"/>
+        </w:rPr>
+        <w:t xml:space="preserve">[ ] </w:t>
+      </w:r>
+      <w:r>
+        <w:rPr>
+          <w:b/>
+          <w:sz w:val="21"/>
+        </w:rPr>
+        <w:t>Sau khi xong Bước 3, hỏi user chọn hướng đi tiếp theo nếu chưa rõ ở Bước 1</w:t>
+      </w:r>
+      <w:r>
+        <w:rPr>
+          <w:sz w:val="21"/>
+        </w:rPr>
+        <w:t xml:space="preserve"> (</w:t>
+      </w:r>
+      <w:r>
+        <w:rPr>
+          <w:rFonts w:ascii="Courier New" w:hAnsi="Courier New"/>
+          <w:color w:val="F05922"/>
+          <w:sz w:val="21"/>
+        </w:rPr>
+        <w:t>AskUserQuestion</w:t>
+      </w:r>
+      <w:r>
+        <w:rPr>
+          <w:sz w:val="21"/>
+        </w:rPr>
+        <w:t>): "Bạn muốn (A) đề xuất áp dụng cụ thể vào KZTEK, hay (B) mình giải thích sâu hơn để bạn nắm nguyên lý/cách vận hành?" — rồi rẽ đúng nhánh dưới đây.</w:t>
       </w:r>
     </w:p>
     <w:p>
@@ -931,7 +1357,7 @@
           <w:color w:val="4A3F8C"/>
           <w:sz w:val="24"/>
         </w:rPr>
-        <w:t>Bước 3b — Viết bảng đề xuất cải tiến (dựa trên phân tích Bước 3)</w:t>
+        <w:t>Bước 3b — Viết bảng đề xuất cải tiến (dựa trên phân tích Bước 3) — CHỈ Mode A</w:t>
       </w:r>
     </w:p>
     <w:p>
@@ -1083,7 +1509,7 @@
           <w:color w:val="4A3F8C"/>
           <w:sz w:val="24"/>
         </w:rPr>
-        <w:t>Bước 4 — Chờ user xác nhận &amp; cập nhật cải tiến</w:t>
+        <w:t>Bước 4 — Chờ user xác nhận &amp; cập nhật cải tiến — CHỈ Mode A</w:t>
       </w:r>
     </w:p>
     <w:p>
@@ -1176,7 +1602,7 @@
           <w:color w:val="4A3F8C"/>
           <w:sz w:val="24"/>
         </w:rPr>
-        <w:t>Bước 5 — Xác nhận và merge về main</w:t>
+        <w:t>Bước 5 — Xác nhận và merge về main — CHỈ Mode A</w:t>
       </w:r>
     </w:p>
     <w:p>
@@ -1269,6 +1695,344 @@
     </w:p>
     <w:p>
       <w:pPr>
+        <w:pStyle w:val="Heading3"/>
+        <w:spacing w:before="160" w:after="60"/>
+      </w:pPr>
+      <w:r>
+        <w:rPr>
+          <w:color w:val="4A3F8C"/>
+          <w:sz w:val="24"/>
+        </w:rPr>
+        <w:t>Bước 3c — Hỏi user muốn tìm hiểu gì tiếp theo — CHỈ Mode B</w:t>
+      </w:r>
+    </w:p>
+    <w:p>
+      <w:pPr>
+        <w:spacing w:before="40" w:after="40"/>
+        <w:ind w:left="567"/>
+        <w:pBdr>
+          <w:left w:val="single" w:sz="12" w:space="10" w:color="F05922"/>
+        </w:pBdr>
+      </w:pPr>
+      <w:r>
+        <w:rPr>
+          <w:color w:val="4A3F8C"/>
+        </w:rPr>
+        <w:t xml:space="preserve">Thay thế hoàn toàn Bước 3b/4/5 khi mục đích là học tập/tham khảo. Mục tiêu cuối: </w:t>
+      </w:r>
+      <w:r>
+        <w:rPr>
+          <w:b/>
+          <w:color w:val="4A3F8C"/>
+        </w:rPr>
+        <w:t>user tự tin nắm rõ nguyên lý, cách vận hành, cách áp dụng</w:t>
+      </w:r>
+      <w:r>
+        <w:rPr>
+          <w:color w:val="4A3F8C"/>
+        </w:rPr>
+        <w:t xml:space="preserve"> — không phải để tạo bảng đề xuất áp dụng KZTEK.</w:t>
+      </w:r>
+    </w:p>
+    <w:p>
+      <w:pPr>
+        <w:pStyle w:val="ListBullet"/>
+        <w:spacing w:after="20"/>
+        <w:ind w:left="283"/>
+      </w:pPr>
+      <w:r>
+        <w:rPr>
+          <w:sz w:val="21"/>
+        </w:rPr>
+        <w:t>[ ] Sau khi trình bày phân tích Bước 3, hỏi user (</w:t>
+      </w:r>
+      <w:r>
+        <w:rPr>
+          <w:rFonts w:ascii="Courier New" w:hAnsi="Courier New"/>
+          <w:color w:val="F05922"/>
+          <w:sz w:val="21"/>
+        </w:rPr>
+        <w:t>AskUserQuestion</w:t>
+      </w:r>
+      <w:r>
+        <w:rPr>
+          <w:sz w:val="21"/>
+        </w:rPr>
+        <w:t>, có thể nhiều lựa chọn) muốn đi sâu vào phần nào:</w:t>
+      </w:r>
+    </w:p>
+    <w:p>
+      <w:pPr>
+        <w:pStyle w:val="ListBullet"/>
+        <w:spacing w:after="20"/>
+        <w:ind w:left="567"/>
+      </w:pPr>
+      <w:r>
+        <w:rPr>
+          <w:sz w:val="21"/>
+        </w:rPr>
+        <w:t>"Giải thích nguyên lý hoạt động" (cơ chế bên trong, thuật toán, luồng dữ liệu, tại sao thiết kế như vậy).</w:t>
+      </w:r>
+    </w:p>
+    <w:p>
+      <w:pPr>
+        <w:pStyle w:val="ListBullet"/>
+        <w:spacing w:after="20"/>
+        <w:ind w:left="567"/>
+      </w:pPr>
+      <w:r>
+        <w:rPr>
+          <w:sz w:val="21"/>
+        </w:rPr>
+        <w:t>"Hướng dẫn áp dụng / sử dụng" (cách setup, cách dùng thực tế, ví dụ minh họa, tình huống áp dụng).</w:t>
+      </w:r>
+    </w:p>
+    <w:p>
+      <w:pPr>
+        <w:pStyle w:val="ListBullet"/>
+        <w:spacing w:after="20"/>
+        <w:ind w:left="567"/>
+      </w:pPr>
+      <w:r>
+        <w:rPr>
+          <w:sz w:val="21"/>
+        </w:rPr>
+        <w:t>"Cả hai".</w:t>
+      </w:r>
+    </w:p>
+    <w:p>
+      <w:pPr>
+        <w:pStyle w:val="ListBullet"/>
+        <w:spacing w:after="20"/>
+        <w:ind w:left="567"/>
+      </w:pPr>
+      <w:r>
+        <w:rPr>
+          <w:sz w:val="21"/>
+        </w:rPr>
+        <w:t>"Chỉ cần bản phân tích, không cần thêm" → nếu chọn mục này, bỏ qua Bước 3d, sang thẳng Bước 3e để chốt tài liệu.</w:t>
+      </w:r>
+    </w:p>
+    <w:p>
+      <w:pPr>
+        <w:pStyle w:val="Heading3"/>
+        <w:spacing w:before="160" w:after="60"/>
+      </w:pPr>
+      <w:r>
+        <w:rPr>
+          <w:color w:val="4A3F8C"/>
+          <w:sz w:val="24"/>
+        </w:rPr>
+        <w:t>Bước 3d — Giải thích tương tác đến khi user xác nhận đã nắm rõ — CHỈ Mode B</w:t>
+      </w:r>
+    </w:p>
+    <w:p>
+      <w:pPr>
+        <w:pStyle w:val="ListBullet"/>
+        <w:spacing w:after="20"/>
+        <w:ind w:left="283"/>
+      </w:pPr>
+      <w:r>
+        <w:rPr>
+          <w:sz w:val="21"/>
+        </w:rPr>
+        <w:t>[ ] Dựa trên lựa chọn ở Bước 3c, giải thích rõ ràng, có ví dụ cụ thể trích từ repo nguồn (file/dòng/pattern thật, không nói chung chung):</w:t>
+      </w:r>
+    </w:p>
+    <w:p>
+      <w:pPr>
+        <w:pStyle w:val="ListBullet"/>
+        <w:spacing w:after="20"/>
+        <w:ind w:left="567"/>
+      </w:pPr>
+      <w:r>
+        <w:rPr>
+          <w:sz w:val="21"/>
+        </w:rPr>
+        <w:t>Nguyên lý hoạt động: cơ chế, thuật toán, data flow, lý do thiết kế.</w:t>
+      </w:r>
+    </w:p>
+    <w:p>
+      <w:pPr>
+        <w:pStyle w:val="ListBullet"/>
+        <w:spacing w:after="20"/>
+        <w:ind w:left="567"/>
+      </w:pPr>
+      <w:r>
+        <w:rPr>
+          <w:sz w:val="21"/>
+        </w:rPr>
+        <w:t>Hướng dẫn áp dụng/sử dụng: các bước cụ thể để cài đặt/chạy thử/áp dụng pattern đó, kèm ví dụ.</w:t>
+      </w:r>
+    </w:p>
+    <w:p>
+      <w:pPr>
+        <w:pStyle w:val="ListBullet"/>
+        <w:spacing w:after="20"/>
+        <w:ind w:left="283"/>
+      </w:pPr>
+      <w:r>
+        <w:rPr>
+          <w:sz w:val="21"/>
+        </w:rPr>
+        <w:t>[ ] Sau mỗi lượt giải thích, hỏi user còn thắc mắc gì thêm không — lặp lại vòng hỏi-đáp cho đến khi user xác nhận rõ ràng đã hiểu (VD: "rõ rồi", "ok hiểu rồi", "đủ rồi").</w:t>
+      </w:r>
+    </w:p>
+    <w:p>
+      <w:pPr>
+        <w:pStyle w:val="ListBullet"/>
+        <w:spacing w:after="20"/>
+        <w:ind w:left="283"/>
+      </w:pPr>
+      <w:r>
+        <w:rPr>
+          <w:sz w:val="21"/>
+        </w:rPr>
+        <w:t>[ ] KHÔNG tự ý chuyển sang Bước 3e khi user chưa xác nhận đã nắm rõ — đây là mục tiêu chính của Mode B, không được rút ngắn.</w:t>
+      </w:r>
+    </w:p>
+    <w:p>
+      <w:pPr>
+        <w:pStyle w:val="ListBullet"/>
+        <w:spacing w:after="20"/>
+        <w:ind w:left="283"/>
+      </w:pPr>
+      <w:r>
+        <w:rPr>
+          <w:sz w:val="21"/>
+        </w:rPr>
+        <w:t>[ ] Nếu giữa chừng user đổi ý muốn áp dụng vào KZTEK → dừng Mode B, chuyển sang Mode A (Bước 3b trở đi), thông báo rõ cho user về việc chuyển mode.</w:t>
+      </w:r>
+    </w:p>
+    <w:p>
+      <w:pPr>
+        <w:pStyle w:val="Heading3"/>
+        <w:spacing w:before="160" w:after="60"/>
+      </w:pPr>
+      <w:r>
+        <w:rPr>
+          <w:color w:val="4A3F8C"/>
+          <w:sz w:val="24"/>
+        </w:rPr>
+        <w:t>Bước 3e — Viết tài liệu tổng hợp cuối cùng — CHỈ Mode B</w:t>
+      </w:r>
+    </w:p>
+    <w:p>
+      <w:pPr>
+        <w:pStyle w:val="ListBullet"/>
+        <w:spacing w:after="20"/>
+        <w:ind w:left="283"/>
+      </w:pPr>
+      <w:r>
+        <w:rPr>
+          <w:sz w:val="21"/>
+        </w:rPr>
+        <w:t xml:space="preserve">[ ] Sau khi user xác nhận đã nắm rõ, tổng hợp toàn bộ nội dung đã trao đổi (phân tích Bước 3 + phần giải thích nguyên lý + hướng dẫn áp dụng ở Bước 3d) vào cùng file </w:t>
+      </w:r>
+      <w:r>
+        <w:rPr>
+          <w:rFonts w:ascii="Courier New" w:hAnsi="Courier New"/>
+          <w:color w:val="F05922"/>
+          <w:sz w:val="21"/>
+        </w:rPr>
+        <w:t>docs/research/RESEARCH-&lt;repo-slug&gt;-&lt;YYYY-MM-DD&gt;.md</w:t>
+      </w:r>
+      <w:r>
+        <w:rPr>
+          <w:sz w:val="21"/>
+        </w:rPr>
+        <w:t>, bổ sung 2 mục:</w:t>
+      </w:r>
+    </w:p>
+    <w:p>
+      <w:pPr>
+        <w:pStyle w:val="ListBullet"/>
+        <w:spacing w:after="20"/>
+        <w:ind w:left="567"/>
+      </w:pPr>
+      <w:r>
+        <w:rPr>
+          <w:b/>
+          <w:sz w:val="21"/>
+        </w:rPr>
+        <w:t>Nguyên lý hoạt động:</w:t>
+      </w:r>
+      <w:r>
+        <w:rPr>
+          <w:sz w:val="21"/>
+        </w:rPr>
+        <w:t xml:space="preserve"> tóm tắt lại phần đã giải thích, có cấu trúc rõ ràng (không phải chép lại nguyên văn hội thoại).</w:t>
+      </w:r>
+    </w:p>
+    <w:p>
+      <w:pPr>
+        <w:pStyle w:val="ListBullet"/>
+        <w:spacing w:after="20"/>
+        <w:ind w:left="567"/>
+      </w:pPr>
+      <w:r>
+        <w:rPr>
+          <w:b/>
+          <w:sz w:val="21"/>
+        </w:rPr>
+        <w:t>Hướng dẫn áp dụng/sử dụng:</w:t>
+      </w:r>
+      <w:r>
+        <w:rPr>
+          <w:sz w:val="21"/>
+        </w:rPr>
+        <w:t xml:space="preserve"> các bước cụ thể, có thể copy-paste dùng lại sau này.</w:t>
+      </w:r>
+    </w:p>
+    <w:p>
+      <w:pPr>
+        <w:pStyle w:val="ListBullet"/>
+        <w:spacing w:after="20"/>
+        <w:ind w:left="283"/>
+      </w:pPr>
+      <w:r>
+        <w:rPr>
+          <w:sz w:val="21"/>
+        </w:rPr>
+        <w:t>[ ] Xuất DOCX + PDF (§19 CLAUDE.md).</w:t>
+      </w:r>
+    </w:p>
+    <w:p>
+      <w:pPr>
+        <w:pStyle w:val="ListBullet"/>
+        <w:spacing w:after="20"/>
+        <w:ind w:left="283"/>
+      </w:pPr>
+      <w:r>
+        <w:rPr>
+          <w:sz w:val="21"/>
+        </w:rPr>
+        <w:t>[ ] Hỏi user xác nhận merge nhánh nghiên cứu (chỉ chứa tài liệu, không có thay đổi code KZTEK) về main — theo đúng Git Safety Protocol, không suy đoán từ xác nhận trước đó.</w:t>
+      </w:r>
+    </w:p>
+    <w:p>
+      <w:pPr>
+        <w:pStyle w:val="ListBullet"/>
+        <w:spacing w:after="20"/>
+        <w:ind w:left="283"/>
+      </w:pPr>
+      <w:r>
+        <w:rPr>
+          <w:sz w:val="21"/>
+        </w:rPr>
+        <w:t>[ ] Sau khi được xác nhận → merge, báo cáo kết quả.</w:t>
+      </w:r>
+    </w:p>
+    <w:p>
+      <w:pPr>
+        <w:pBdr>
+          <w:bottom w:val="single" w:sz="6" w:space="1" w:color="F05922"/>
+        </w:pBdr>
+        <w:spacing w:after="120"/>
+      </w:pPr>
+    </w:p>
+    <w:p>
+      <w:pPr>
         <w:pStyle w:val="Heading2"/>
         <w:spacing w:before="200" w:after="80"/>
       </w:pPr>
@@ -1317,7 +2081,7 @@
         <w:rPr>
           <w:sz w:val="21"/>
         </w:rPr>
-        <w:t xml:space="preserve"> Sau mỗi bước (Bước 1–5) hoàn thành, append 1 dòng vào </w:t>
+        <w:t xml:space="preserve"> Sau mỗi bước (Bước 1–5 cho Mode A, hoặc Bước 1–3 + 3c/3d/3e cho Mode B) hoàn thành, append 1 dòng vào </w:t>
       </w:r>
       <w:r>
         <w:rPr>
@@ -1516,7 +2280,20 @@
         <w:rPr>
           <w:sz w:val="21"/>
         </w:rPr>
-        <w:t>User yêu cầu merge nhưng chưa từng xác nhận danh sách đề xuất áp dụng ở Bước 4.</w:t>
+        <w:t>(Mode A) User yêu cầu merge nhưng chưa từng xác nhận danh sách đề xuất áp dụng ở Bước 4.</w:t>
+      </w:r>
+    </w:p>
+    <w:p>
+      <w:pPr>
+        <w:pStyle w:val="ListBullet"/>
+        <w:spacing w:after="20"/>
+        <w:ind w:left="283"/>
+      </w:pPr>
+      <w:r>
+        <w:rPr>
+          <w:sz w:val="21"/>
+        </w:rPr>
+        <w:t>(Mode B) Agent tự ý chốt tài liệu tổng hợp (Bước 3e) khi user chưa xác nhận đã nắm rõ nguyên lý/cách áp dụng ở Bước 3d — PHẢI dừng lại hỏi thêm, không tự suy đoán user đã hiểu.</w:t>
       </w:r>
     </w:p>
     <w:p>
@@ -1612,7 +2389,7 @@
         <w:rPr>
           <w:sz w:val="21"/>
         </w:rPr>
-        <w:t xml:space="preserve"> — tóm tắt + bảng đề xuất + trạng thái áp dụng (✅/❌).</w:t>
+        <w:t xml:space="preserve"> — Mode A: tóm tắt + bảng đề xuất + trạng thái áp dụng (✅/❌). Mode B: tóm tắt + mục "Nguyên lý hoạt động" + "Hướng dẫn áp dụng/sử dụng".</w:t>
       </w:r>
     </w:p>
     <w:p>
@@ -1688,7 +2465,7 @@
         <w:rPr>
           <w:sz w:val="21"/>
         </w:rPr>
-        <w:t xml:space="preserve"> chứa toàn bộ commit của quá trình nghiên cứu + áp dụng cải tiến.</w:t>
+        <w:t xml:space="preserve"> chứa toàn bộ commit của quá trình nghiên cứu (+ áp dụng cải tiến nếu Mode A).</w:t>
       </w:r>
     </w:p>
     <w:p>
@@ -1701,7 +2478,7 @@
         <w:rPr>
           <w:sz w:val="21"/>
         </w:rPr>
-        <w:t>Nếu có thay đổi code/tài liệu áp dụng vào KZTEK → tuân thủ đầy đủ checklist đồng bộ tài liệu (§15.3 CLAUDE.md) trước khi coi là DONE.</w:t>
+        <w:t>Nếu có thay đổi code/tài liệu áp dụng vào KZTEK (Mode A) → tuân thủ đầy đủ checklist đồng bộ tài liệu (§15.3 CLAUDE.md) trước khi coi là DONE.</w:t>
       </w:r>
     </w:p>
     <w:sectPr>

</xml_diff>